<commit_message>
Updated the entire essay. Final draft.
</commit_message>
<xml_diff>
--- a/absalom_four_dimensions_6_24.docx
+++ b/absalom_four_dimensions_6_24.docx
@@ -408,7 +408,7 @@
         <w:t xml:space="preserve"> </w:t>
       </w:r>
       <w:r>
-        <w:t xml:space="preserve">is that it is not a whodunit, but rather a why-done-it. Within the first several pages, the basic facts of the case are laid out: A stranger, Thomas Sutpen, appears in Jefferson one day, builds a plantation, and marries Ellen Coldfield. They have two children: Judith and Henry. Later, Henry’s close friend, Charles Bon, wants to marry Judith, but on the day of their wedding Henry shoots him and disappears. His daughter unwed, his son gone, and no heir to his estate, Sutpen slides into dissolution. Quentin Compson, the novel’s main detective of sorts, will spend the remainder of the narrative trying to understand why Henry shot Bon by working through the various possible motivations in his conversations with the story’s other narrators: Ellen’s sister Rosa, his father, and his Harvard roommate, Shreve McCannon. No verifiable answer is ever provided, but Quentin avers that Charles was, in fact, Sutpen’s son by a Haitian-born woman with part Black ancestry, Eulalia Bon. The resulting union between Judith and Charles would have constituted incest and</w:t>
+        <w:t xml:space="preserve">is that it is not a whodunit, but rather a why-done-it. Within the first several pages, the basic facts of the case are laid out: A stranger, Thomas Sutpen, appears in Jefferson one day, builds a plantation, and marries Ellen Coldfield. They have two children: Judith and Henry. Later, Henry’s close friend, Charles Bon, wants to marry Judith, but on the day of their wedding, Henry shoots him and disappears. His daughter unwed, his son gone, and no heir to his estate, Sutpen slides into dissolution. Quentin Compson, the novel’s main detective of sorts, will spend the remainder of the narrative trying to understand why Henry shot Bon by working through the various possible motivations in his conversations with the story’s other narrators: Ellen’s sister Rosa, his father, and his Harvard roommate, Shreve McCannon. No verifiable answer is ever provided, but Quentin avers that Charles was, in fact, Sutpen’s son by a Haitian-born woman with part Black ancestry, Eulalia Bon. The resulting union between Judith and Charles would have constituted incest and</w:t>
       </w:r>
       <w:r>
         <w:t xml:space="preserve"> </w:t>
@@ -519,7 +519,20 @@
         <w:t xml:space="preserve">(303)</w:t>
       </w:r>
       <w:r>
-        <w:t xml:space="preserve">. Faulkner flips this ratio and claims that there are 6,298 Whites and 9,313</w:t>
+        <w:t xml:space="preserve">. On the map he drew for</w:t>
+      </w:r>
+      <w:r>
+        <w:t xml:space="preserve"> </w:t>
+      </w:r>
+      <w:r>
+        <w:rPr>
+          <w:iCs/>
+          <w:i/>
+        </w:rPr>
+        <w:t xml:space="preserve">Absalom, Absalom!</w:t>
+      </w:r>
+      <w:r>
+        <w:t xml:space="preserve">, Faulkner flips this ratio and claims that there are 6,298 Whites and 9,313</w:t>
       </w:r>
       <w:r>
         <w:t xml:space="preserve"> </w:t>
@@ -587,7 +600,7 @@
         <w:pStyle w:val="BodyText"/>
       </w:pPr>
       <w:r>
-        <w:t xml:space="preserve">Yet, this static picture the characters is deceptive for several reasons. First, it masks the editorial decisions behind the data. For example, there is no concrete evidence that Charles Bon’s mother was part Black, and it is therefore not self-evident that he should be coded as</w:t>
+        <w:t xml:space="preserve">Yet, this static picture of the characters is deceptive for several reasons. First, it masks the editorial decisions behind the data. For example, there is no concrete evidence that Charles Bon’s mother was part Black, and it is therefore not self-evident that he should be coded as</w:t>
       </w:r>
       <w:r>
         <w:t xml:space="preserve"> </w:t>
@@ -701,32 +714,29 @@
         <w:t xml:space="preserve">“</w:t>
       </w:r>
       <w:r>
-        <w:t xml:space="preserve">screen time</w:t>
-      </w:r>
-      <w:r>
-        <w:t xml:space="preserve">”</w:t>
-      </w:r>
-      <w:r>
-        <w:t xml:space="preserve"> </w:t>
-      </w:r>
-      <w:r>
-        <w:t xml:space="preserve">a character might get in a movie. The distinction is significant. For example, the extraterrestrial being in the movie</w:t>
-      </w:r>
-      <w:r>
-        <w:t xml:space="preserve"> </w:t>
-      </w:r>
-      <w:r>
-        <w:rPr>
-          <w:iCs/>
-          <w:i/>
-        </w:rPr>
-        <w:t xml:space="preserve">E.T.</w:t>
-      </w:r>
-      <w:r>
-        <w:t xml:space="preserve"> </w:t>
-      </w:r>
-      <w:r>
-        <w:t xml:space="preserve">represents a demographic count of one, but has a lot of screen time because they are the main character. The chart below (Figure 1) shows both the raw demographic data and the frequency of character presence by race.</w:t>
+        <w:t xml:space="preserve">stage time</w:t>
+      </w:r>
+      <w:r>
+        <w:t xml:space="preserve">”</w:t>
+      </w:r>
+      <w:r>
+        <w:t xml:space="preserve"> </w:t>
+      </w:r>
+      <w:r>
+        <w:t xml:space="preserve">a character might get in a play. The distinction is significant. For example, there is only one Moor character in</w:t>
+      </w:r>
+      <w:r>
+        <w:t xml:space="preserve"> </w:t>
+      </w:r>
+      <w:r>
+        <w:rPr>
+          <w:iCs/>
+          <w:i/>
+        </w:rPr>
+        <w:t xml:space="preserve">Othello</w:t>
+      </w:r>
+      <w:r>
+        <w:t xml:space="preserve">, but Iago is obviously present on stage quite a bit. The chart below (Figure 1) shows both the raw demographic data and the frequency of character presence by race.</w:t>
       </w:r>
     </w:p>
     <w:p>
@@ -736,7 +746,7 @@
       <w:r>
         <w:drawing>
           <wp:inline>
-            <wp:extent cx="5943600" cy="2611933"/>
+            <wp:extent cx="4902332" cy="2154345"/>
             <wp:effectExtent b="0" l="0" r="0" t="0"/>
             <wp:docPr descr="Figure 1: Demography by raw count and by character presence. The image on the left shows what percentage of each type of character is present in the text. The image on the right shows how often they appear." title="" id="1" name="Picture"/>
             <a:graphic>
@@ -757,7 +767,7 @@
                   <pic:spPr bwMode="auto">
                     <a:xfrm>
                       <a:off x="0" y="0"/>
-                      <a:ext cx="5943600" cy="2611933"/>
+                      <a:ext cx="4902332" cy="2154345"/>
                     </a:xfrm>
                     <a:prstGeom prst="rect">
                       <a:avLst/>
@@ -807,7 +817,7 @@
         <w:t xml:space="preserve"> </w:t>
       </w:r>
       <w:r>
-        <w:t xml:space="preserve">do not register because they are present in less than 1% of the text. Second, even though they are a demographic minority, the relative share of mixed ancestry characters increases to 16% when their actual presence is taken into account. The statistics affirm what is should be readily apparent from reading the text: characters with mixed ancestry feature prominently. The very existence of such characters represented a threat. As Eric Sundquist explains,</w:t>
+        <w:t xml:space="preserve">do not register because they are present in less than 1% of the text. Second, even though they are a demographic minority, the relative share of mixed ancestry characters increases to 16% when their actual presence is taken into account. The statistics affirm what should be readily apparent from reading the text: characters with mixed ancestry feature prominently. The very existence of such characters represented a threat. As Eric Sundquist explains,</w:t>
       </w:r>
       <w:r>
         <w:t xml:space="preserve"> </w:t>
@@ -1137,7 +1147,7 @@
         <w:t xml:space="preserve"> </w:t>
       </w:r>
       <w:r>
-        <w:t xml:space="preserve">brute (173). Although ostensibly hyper-masculine, he is incapable of expressing any desire at all except unintelligible howling. These various alternative versions of mixed ancestry all suggest that in the minds of the narrators, and perhaps Faulkner as well, racial divergence also resulted in deviations from norms surrounding gender and sexuality. It also implies that the opposite is true, a deviation in how someone expresses their gender or sexual desire means someone is not truly White. In this sense, the real danger is not that Charles desires Judith, but rather that she desires him.</w:t>
+        <w:t xml:space="preserve">brute (173). He is so hyper-masculine that he is incapable of rational thought, and cannot express any desire at all except unintelligible howling. These various alternative versions of mixed ancestry all suggest that in the minds of the narrators, and perhaps Faulkner as well, racial divergence resulted in deviations from norms surrounding gender and sexuality. It also implies that a deviation in how someone expresses their gender or sexual desire means someone is not truly White. In this sense, the real danger is not that Charles desires Judith, but rather that she desires him.</w:t>
       </w:r>
     </w:p>
     <w:p>
@@ -1315,7 +1325,7 @@
         <w:t xml:space="preserve"> </w:t>
       </w:r>
       <w:r>
-        <w:t xml:space="preserve">for the French architect. Ultimately, he cannot escape his class. After the Civil War he reverts to his</w:t>
+        <w:t xml:space="preserve">for the French architect. Ultimately, he cannot escape his class. After the Civil War, he reverts to his</w:t>
       </w:r>
       <w:r>
         <w:t xml:space="preserve"> </w:t>
@@ -1464,7 +1474,7 @@
         <w:pStyle w:val="FirstParagraph"/>
       </w:pPr>
       <w:r>
-        <w:t xml:space="preserve">Sutpen rise, fall, and long shadow he casts, parallel that of slave capitalism. This economic system relied on the ceaseless expropriation of land and the routine torture of a racialized labor force to maximize agricultural production</w:t>
+        <w:t xml:space="preserve">Sutpen’s rise, fall, and the long shadow he casts, parallel that of slave capitalism. This economic system relied on the ceaseless expropriation of land and the routine torture of a racialized labor force to maximize agricultural production</w:t>
       </w:r>
       <w:r>
         <w:t xml:space="preserve"> </w:t>
@@ -1491,7 +1501,7 @@
         <w:t xml:space="preserve"> </w:t>
       </w:r>
       <w:r>
-        <w:t xml:space="preserve">in backward region, new scholarship has shown that slave capitalism was the commercial engine that shaped the modern transatlantic world</w:t>
+        <w:t xml:space="preserve">in a backward region, new scholarship has shown that slave capitalism was the commercial engine that shaped the modern transatlantic world</w:t>
       </w:r>
       <w:r>
         <w:t xml:space="preserve"> </w:t>
@@ -1518,7 +1528,7 @@
         <w:t xml:space="preserve"> </w:t>
       </w:r>
       <w:r>
-        <w:t xml:space="preserve">history of Sutpen’s rise to power through this system, reveals slavery was neither confined the carceral space of the plantation or the racial apartheid regime of the South, but extended along global networks of trade. True, Sutpen’s Hundred and its environs are the central locus for a plurality of the action (36%), but just over a third of the events take place outside of the county (35%). One way of representing this narrative spatially is to view the plantation as a key node of a network that stretches across space and time. The resulting constellation underscore how the Plantation cannot be imagined without the slave capitalism system that engendered it.</w:t>
+        <w:t xml:space="preserve">history of Sutpen’s rise to power through this system, reveals slavery was neither confined to the carceral space of the plantation or the racial apartheid regime of the South, but extended along global networks of trade. True, Sutpen’s Hundred and its environs are the central locus for a plurality of the action (36%), but just over a third of the events take place outside of the county (35%). One way of representing this narrative spatially is to view the plantation as a key node of a network that stretches across space and time. The resulting constellation underscore how the Plantation cannot be imagined without the slave capitalism system that engendered it.</w:t>
       </w:r>
     </w:p>
     <w:p>
@@ -1827,7 +1837,7 @@
         <w:pStyle w:val="BodyText"/>
       </w:pPr>
       <w:r>
-        <w:t xml:space="preserve">Beyond these locations, the global connections enmesh the text in the larger transatlantic circuit. The extensive distances between these locations suggests that the slave capitalism is not only maintained through intimate social relations, but also reticulated across a network interlocking spaces. The various characters use these spaces to continuously displace the evils of slavery onto a place</w:t>
+        <w:t xml:space="preserve">Beyond these locations, the global connections enmesh the text in the larger transatlantic circuit. The extensive distances between these locations suggests that slave capitalism is not only maintained through intimate social relations, but also reticulated across a network of interlocking spaces. The various characters use these spaces to continuously displace the evils of slavery onto a place</w:t>
       </w:r>
       <w:r>
         <w:t xml:space="preserve"> </w:t>
@@ -1935,7 +1945,7 @@
         <w:t xml:space="preserve"> </w:t>
       </w:r>
       <w:r>
-        <w:t xml:space="preserve">enslaved peoples (48). Meanwhile, Quentin’s grandfather and, in turn, his father, describes Haiti as,</w:t>
+        <w:t xml:space="preserve">enslaved peoples (48). Meanwhile, Quentin’s grandfather and, in turn, his father, describe Haiti as,</w:t>
       </w:r>
       <w:r>
         <w:t xml:space="preserve"> </w:t>
@@ -2077,7 +2087,7 @@
         <w:pStyle w:val="BodyText"/>
       </w:pPr>
       <w:r>
-        <w:t xml:space="preserve">As the constellation of locations suggests, slavery capitalism does not stop neatly at the Mason-Dixon line, and also undergirds Quentin’s attendance at Harvard. Despite its role in the abolitionist movement, Harvard, directly and indirectly profited from slavery</w:t>
+        <w:t xml:space="preserve">As the constellation of locations suggests, slavery capitalism does not stop neatly at the Mason-Dixon line, and also undergirds Quentin’s attendance at Harvard. Despite its role in the abolitionist movement, Harvard directly and indirectly profited from slavery</w:t>
       </w:r>
       <w:r>
         <w:t xml:space="preserve"> </w:t>
@@ -2086,7 +2096,7 @@
         <w:t xml:space="preserve">(Beckert et al. 226)</w:t>
       </w:r>
       <w:r>
-        <w:t xml:space="preserve">. Moreover, Quentin is following in the footsteps of other sons of slave owners and, later, former slave owners who went to Harvard and other elite Northern institutions to be conferred a degree and respectability</w:t>
+        <w:t xml:space="preserve">. Moreover, Quentin is following in the footsteps of other sons of slave owners and, later, former slave owners who went to Harvard or other elite Northern institutions to be conferred a degree and respectability</w:t>
       </w:r>
       <w:r>
         <w:t xml:space="preserve"> </w:t>
@@ -2108,7 +2118,23 @@
         <w:t xml:space="preserve">Absalom, Absalom!</w:t>
       </w:r>
       <w:r>
-        <w:t xml:space="preserve">, in The Sound and the Fury it is clear that the tract of land Quentin’s father sells to send his son to school belonged to the Compson plantation. The residual wealth from a system of subjugation that officially ended fifty years previous still helps pay for his tuition.</w:t>
+        <w:t xml:space="preserve">, in</w:t>
+      </w:r>
+      <w:r>
+        <w:t xml:space="preserve"> </w:t>
+      </w:r>
+      <w:r>
+        <w:rPr>
+          <w:iCs/>
+          <w:i/>
+        </w:rPr>
+        <w:t xml:space="preserve">The Sound and the Fury</w:t>
+      </w:r>
+      <w:r>
+        <w:t xml:space="preserve"> </w:t>
+      </w:r>
+      <w:r>
+        <w:t xml:space="preserve">it is clear that the tract of land Quentin’s father sells to send his son to school belonged to the Compson plantation. The residual wealth from a system of subjugation that officially ended fifty years previous still helps pay for his tuition.</w:t>
       </w:r>
     </w:p>
     <w:p>
@@ -2188,7 +2214,7 @@
         <w:t xml:space="preserve"> </w:t>
       </w:r>
       <w:r>
-        <w:t xml:space="preserve">(302). It is unclear how much of this is Shreve’s trademark flippancy, but even in his glib sermonizing about the fate of the western world, he reveals profound anxieties over the disappearance of</w:t>
+        <w:t xml:space="preserve">(302). It is unclear how much of this is Shreve’s trademark flippancy, but even in his glib sermonizing about the fate of the Western world, he reveals profound anxieties over the disappearance of</w:t>
       </w:r>
       <w:r>
         <w:t xml:space="preserve"> </w:t>
@@ -2242,7 +2268,7 @@
         <w:t xml:space="preserve"> </w:t>
       </w:r>
       <w:r>
-        <w:t xml:space="preserve">suggesting that Black heritage represents an inferiority beyond skin color (303). Shreve’s own obsessions with race suggests that the legacy of enslavement cannot be told through one individual family, region, or, even country, but is, in fact, the origin story of the western world itself.</w:t>
+        <w:t xml:space="preserve">suggesting that Black heritage represents an inferiority beyond skin color (303). Shreve’s own obsessions with race suggests that the legacy of enslavement cannot be told through one individual family, region, or, even country, but is, in fact, the origin story of the Western world itself.</w:t>
       </w:r>
     </w:p>
     <w:bookmarkEnd w:id="28"/>
@@ -2435,7 +2461,55 @@
         <w:t xml:space="preserve"> </w:t>
       </w:r>
       <w:r>
-        <w:t xml:space="preserve">This data formed the foundation for the encoding of Absalom, Absalom! in the DY database, and helped in mapping out a chronology. Using this DY data, it is possible to generate a plot structure chart.</w:t>
+        <w:t xml:space="preserve">This data formed the foundation for the encoding of</w:t>
+      </w:r>
+      <w:r>
+        <w:t xml:space="preserve"> </w:t>
+      </w:r>
+      <w:r>
+        <w:rPr>
+          <w:iCs/>
+          <w:i/>
+        </w:rPr>
+        <w:t xml:space="preserve">Absalom, Absalom!</w:t>
+      </w:r>
+      <w:r>
+        <w:t xml:space="preserve"> </w:t>
+      </w:r>
+      <w:r>
+        <w:t xml:space="preserve">in the</w:t>
+      </w:r>
+      <w:r>
+        <w:t xml:space="preserve"> </w:t>
+      </w:r>
+      <w:r>
+        <w:rPr>
+          <w:iCs/>
+          <w:i/>
+        </w:rPr>
+        <w:t xml:space="preserve">DY</w:t>
+      </w:r>
+      <w:r>
+        <w:t xml:space="preserve"> </w:t>
+      </w:r>
+      <w:r>
+        <w:t xml:space="preserve">database, and helped in mapping out a chronology. Using this</w:t>
+      </w:r>
+      <w:r>
+        <w:t xml:space="preserve"> </w:t>
+      </w:r>
+      <w:r>
+        <w:rPr>
+          <w:iCs/>
+          <w:i/>
+        </w:rPr>
+        <w:t xml:space="preserve">DY</w:t>
+      </w:r>
+      <w:r>
+        <w:t xml:space="preserve"> </w:t>
+      </w:r>
+      <w:r>
+        <w:t xml:space="preserve">data, it is possible to generate a plot structure chart.</w:t>
       </w:r>
       <w:r>
         <w:rPr>
@@ -2536,10 +2610,7 @@
         <w:t xml:space="preserve">DY</w:t>
       </w:r>
       <w:r>
-        <w:t xml:space="preserve"> </w:t>
-      </w:r>
-      <w:r>
-        <w:t xml:space="preserve">the narrative structure of every Faulkner text can be accessed through the</w:t>
+        <w:t xml:space="preserve">, the narrative structure of every Faulkner text can be accessed through the</w:t>
       </w:r>
       <w:r>
         <w:t xml:space="preserve"> </w:t>
@@ -2615,7 +2686,7 @@
       <w:r>
         <w:drawing>
           <wp:inline>
-            <wp:extent cx="5943600" cy="2321718"/>
+            <wp:extent cx="4902332" cy="1914973"/>
             <wp:effectExtent b="0" l="0" r="0" t="0"/>
             <wp:docPr descr="Figure 3: Plot Structure of Absalom, Absalom!. Particularly notable, is the repetition of an S pattern throughout. This indicates a similar structure across the chapters." title="" id="1" name="Picture"/>
             <a:graphic>
@@ -2636,7 +2707,7 @@
                   <pic:spPr bwMode="auto">
                     <a:xfrm>
                       <a:off x="0" y="0"/>
-                      <a:ext cx="5943600" cy="2321718"/>
+                      <a:ext cx="4902332" cy="1914973"/>
                     </a:xfrm>
                     <a:prstGeom prst="rect">
                       <a:avLst/>
@@ -2713,7 +2784,7 @@
         <w:t xml:space="preserve"> </w:t>
       </w:r>
       <w:r>
-        <w:t xml:space="preserve">curves. The shape of the curve gives an indication of the narrative pacing. Each narrator opens their story with a lot of detail and a high density of events near the end of the s-curve, but there is a tendency to skip through the middle with larger chronological jumps. Some curves start farther down and others end higher up. This difference in clustering makes more sense relative to the chapter markers. Moving from left to right there is a small S at the bottom of chapter 1, a second one that stretches from chapter 2 to 3, the most substantial one that goes all the way from chapter 4 to the end of chapter 6, and then finally two individual curves in chapter 7 and 8. These patterns suggest the way in which chapters 1 and 2 act as a preview to the story, while chapter 4-6 develop the rising action. Meanwhile, chapters 7 and 8 each in their own way represent a climax, as information that was hinted at previously is explained more fully, if still incompletely. Within chapters there is a consistent pattern as well. They open in the present, drop down into the</w:t>
+        <w:t xml:space="preserve">curves. The shape of the curve gives an indication of the narrative pacing. Each narrator opens their story with a lot of detail and a high density of events near the end of the S-curve, but there is a tendency to skip through the middle with larger chronological jumps. Some curves start farther down and others end higher up. This difference in clustering makes more sense relative to the chapter markers. Moving from left to right, there is a small S at the bottom of chapter 1, a second one that stretches from chapter 2 to 3, the most substantial one that goes all the way from chapter 4 to the end of chapter 6, and then finally two individual curves in chapter 7 and 8. These patterns suggest the way in which chapters 1 and 2 act as a preview to the story, while chapter 4-6 develop the rising action. Meanwhile, chapters 7 and 8 each in their own way represent a climax as information that was hinted at previously is explained more fully, if still incompletely. Within chapters there is a consistent pattern as well. They open in the present, drop down into the</w:t>
       </w:r>
       <w:r>
         <w:t xml:space="preserve"> </w:t>
@@ -2757,7 +2828,7 @@
         <w:pStyle w:val="BodyText"/>
       </w:pPr>
       <w:r>
-        <w:t xml:space="preserve">Based on the chart, it also possible to make basic inferences about patterns in the plot, in particular Faulkner’s use of delayed revelation. In the beginning, Sutpen mysteriously appears in chapters 1 and 2, but we do not get his full story until chapter 7; quite some time after it is revealed that he dies at the end of Chapter 5. His cause of death only becomes clear by the end of Chapter 7. The story of Henry shooting Charles is told in the first couple of pages, and again in chapters 4 and 5, but we do not get the fuller version until the end of Chapter 8. The narrative gives glimpses of the past, but only provides their full context until much later. To add to the complexity of the history, it is told in multiple different ways through different narrators. Generally, events in the past are</w:t>
+        <w:t xml:space="preserve">Based on the chart, it also possible to make basic inferences about patterns in the plot, in particular Faulkner’s use of delayed revelation. In the beginning, Sutpen mysteriously appears in chapters 1 and 2, but we do not get his full story until chapter 7; quite some time after it is revealed that he dies at the end of Chapter 5. His cause of death only becomes clear by the end of Chapter 7. The story of Henry shooting Charles is told in the first couple of pages, and again in chapters 4 and 5, but we do not get the fuller version until the end of Chapter 8. The narrative gives glimpses of the past, but only provides their full context much later. To add to the complexity of the history, it is told in multiple different ways through different narrators. Generally, events in the past are</w:t>
       </w:r>
       <w:r>
         <w:t xml:space="preserve"> </w:t>
@@ -2775,7 +2846,7 @@
         <w:t xml:space="preserve"> </w:t>
       </w:r>
       <w:r>
-        <w:t xml:space="preserve">but they can also be narrated by the third person narrator, or use a more esoteric forms of narration like hypothesizing or a memory within a telling.</w:t>
+        <w:t xml:space="preserve">but they can also be narrated by the third person narrator, or use more esoteric forms of narration like hypothesizing or a memory within a telling.</w:t>
       </w:r>
     </w:p>
     <w:p>
@@ -2783,7 +2854,7 @@
         <w:pStyle w:val="BodyText"/>
       </w:pPr>
       <w:r>
-        <w:t xml:space="preserve">Visually, it is useful to imagine the S curves as continuous undulations of the past disrupting the placid suspension of the narrative present. The various narrators are not so much plumbing the past, but rather riding its currents to navigate the present, or as Quentin muses:</w:t>
+        <w:t xml:space="preserve">Visually, it is useful to imagine the S-curves as continuous undulations of the past disrupting the placid suspension of the narrative present. The various narrators are not so much plumbing the past, but rather riding its currents to navigate the present, or as Quentin muses:</w:t>
       </w:r>
     </w:p>
     <w:p>
@@ -3037,7 +3108,7 @@
         <w:pStyle w:val="BodyText"/>
       </w:pPr>
       <w:r>
-        <w:t xml:space="preserve">The typography of a text is rarely remarkable, but here too</w:t>
+        <w:t xml:space="preserve">The typography of a text is rarely remarkable, but here, too,</w:t>
       </w:r>
       <w:r>
         <w:t xml:space="preserve"> </w:t>
@@ -3176,7 +3247,7 @@
         <w:pStyle w:val="BodyText"/>
       </w:pPr>
       <w:r>
-        <w:t xml:space="preserve">The figure shows several salient features of the text purely based on its typography. First, at bottom is the</w:t>
+        <w:t xml:space="preserve">The figure shows several salient features of the text purely based on its typography. First, at the bottom is the</w:t>
       </w:r>
       <w:r>
         <w:t xml:space="preserve"> </w:t>
@@ -3194,7 +3265,7 @@
         <w:t xml:space="preserve"> </w:t>
       </w:r>
       <w:r>
-        <w:t xml:space="preserve">– the text that is not parenthetical. To some extent this appears indistinguishable from the first nesting level: (). In part, this is simply the consequence of trying to plot too many data points into a small space, but it also demonstrates the ubiquity of parenthetical phrases. With some regularity, this first level nesting is further enframed with second level nesting: (()). The most intense usage of nesting is in chapter 6. In the first couple of pages, the narrative jumps to level one nesting, then second level, and even third ((())), until finally at the apex of the chart Quentin is nested four levels deep, or more colloquially, he is an aside to an aside to an aside to an aside. It is likely a happy accident that Quentin’s name is the only one that is so deeply nested, it is definitely unreasonable to expect any reader to discover this Easter egg without considerable effort. To be sure, it is possible that Faulkner himself lost track of the parenthesis as the number of parenthesis in this chapter is uneven. Formally, there should be an extra closing parenthesis at the end of chapter 6. Be that as it may, to find Quentin dead-center in the text at the deepest parenthetical level reinforces how much</w:t>
+        <w:t xml:space="preserve">– the text that is not parenthetical. To some extent this appears indistinguishable from the first nesting level: (). In part, this is simply the consequence of trying to plot too many data points into a small space, but it also demonstrates the ubiquity of parenthetical phrases. With some regularity, this first level nesting is further enframed with second level nesting: (()). The most intense usage of nesting is in chapter 6. In the first couple of pages, the narrative jumps to level one nesting, then second level, and even third ((())), until finally at the apex of the chart, Quentin is nested four levels deep, or more colloquially, he is an aside to an aside to an aside to an aside. It is likely a happy accident that Quentin’s name is the only one that is so deeply nested, it is definitely unreasonable to expect any reader to discover this Easter egg without considerable effort. To be sure, it is possible that Faulkner himself lost track of the parenthesis as the number of parenthesis in this chapter is uneven. Formally, there should be an extra closing parenthesis at the end of chapter 6. Be that as it may, to find Quentin dead-center in the text at the deepest parenthetical level reinforces how much</w:t>
       </w:r>
       <w:r>
         <w:t xml:space="preserve"> </w:t>
@@ -3210,7 +3281,7 @@
         <w:t xml:space="preserve"> </w:t>
       </w:r>
       <w:r>
-        <w:t xml:space="preserve">is about his confrontation with the past, as it is about the sordid history of the Sutpens. In many respects that makes him the main character, or as Alex Vernon points out,</w:t>
+        <w:t xml:space="preserve">is as much about his confrontation with the past, as it is about the sordid history of the Sutpens. In many respects that makes him the main character, or as Alex Vernon points out,</w:t>
       </w:r>
       <w:r>
         <w:t xml:space="preserve"> </w:t>
@@ -3632,7 +3703,7 @@
         <w:t xml:space="preserve"> </w:t>
       </w:r>
       <w:r>
-        <w:t xml:space="preserve">underscore that the telling cannot be separated from the tale and the teller. How a narrator speaks of characters is dependent on what character the narrator identifies with, the places spoken about depend on the place spoken from, the understanding of the past depends on the time the present is in, and the language spoken with depends on the listener spoken to. In the end, there is no conclusion to the conversation about race in America, only repetition. The conversation appears to be the point though. By never allowing the text to truly ever close, Faulkner forces readers to critically re-examine their own relationships with the past, and, in turn, they relationships with themselves. It is only through this examination of the self that an understanding of the other becomes possible.</w:t>
+        <w:t xml:space="preserve">underscore that the telling cannot be separated from the tale and the teller. How a narrator speaks of characters is dependent on what character the narrator identifies with, the places spoken about depend on the place spoken from, the understanding of the past depends on the time the present is in, and the language spoken with depends on the listener spoken to. In the end, there is no conclusion to the conversation about race in America, only repetition. The conversation appears to be the point, though. By never allowing the text to truly ever close, Faulkner forces readers to critically re-examine their own relationships with the past, and, in turn, their relationships with themselves. It is only through this examination of the self that an understanding of the other becomes possible.</w:t>
       </w:r>
     </w:p>
     <w:bookmarkEnd w:id="42"/>
@@ -3956,7 +4027,7 @@
       </w:r>
     </w:p>
     <w:bookmarkEnd w:id="47"/>
-    <w:bookmarkStart w:id="48" w:name="ref-blotnerFaulknerBiography2005d"/>
+    <w:bookmarkStart w:id="48" w:name="ref-blotnerFaulknerBiography2005b"/>
     <w:p>
       <w:pPr>
         <w:pStyle w:val="Bibliography"/>
@@ -3989,7 +4060,7 @@
         <w:t xml:space="preserve">A Biography</w:t>
       </w:r>
       <w:r>
-        <w:t xml:space="preserve">. One-volume ed,</w:t>
+        <w:t xml:space="preserve">.</w:t>
       </w:r>
       <w:r>
         <w:t xml:space="preserve"> </w:t>
@@ -4080,7 +4151,7 @@
       </w:r>
     </w:p>
     <w:bookmarkEnd w:id="49"/>
-    <w:bookmarkStart w:id="51" w:name="Xafd39e71e9d7aa3c38cff188e00c28fe5de2026"/>
+    <w:bookmarkStart w:id="51" w:name="X15045d4223032613d49b0c63eafac3cbd04016e"/>
     <w:p>
       <w:pPr>
         <w:pStyle w:val="Bibliography"/>
@@ -4107,19 +4178,38 @@
         <w:t xml:space="preserve"> </w:t>
       </w:r>
       <w:r>
+        <w:rPr>
+          <w:iCs/>
+          <w:i/>
+        </w:rPr>
         <w:t xml:space="preserve">Absalom</w:t>
       </w:r>
       <w:r>
+        <w:rPr>
+          <w:iCs/>
+          <w:i/>
+        </w:rPr>
         <w:t xml:space="preserve">,</w:t>
       </w:r>
       <w:r>
         <w:t xml:space="preserve"> </w:t>
       </w:r>
       <w:r>
+        <w:rPr>
+          <w:iCs/>
+          <w:i/>
+        </w:rPr>
         <w:t xml:space="preserve">Absalom</w:t>
       </w:r>
       <w:r>
-        <w:t xml:space="preserve">!”</w:t>
+        <w:rPr>
+          <w:iCs/>
+          <w:i/>
+        </w:rPr>
+        <w:t xml:space="preserve">!</w:t>
+      </w:r>
+      <w:r>
+        <w:t xml:space="preserve">”</w:t>
       </w:r>
       <w:r>
         <w:t xml:space="preserve"> </w:t>
@@ -4132,16 +4222,7 @@
         <w:t xml:space="preserve">Comparative Literature</w:t>
       </w:r>
       <w:r>
-        <w:t xml:space="preserve">, vol. 34, no. 3,</w:t>
-      </w:r>
-      <w:r>
-        <w:t xml:space="preserve"> </w:t>
-      </w:r>
-      <w:r>
-        <w:t xml:space="preserve">[Duke University Press, University of Oregon]</w:t>
-      </w:r>
-      <w:r>
-        <w:t xml:space="preserve">, 1982, pp. 247–68, doi:</w:t>
+        <w:t xml:space="preserve">, vol. 34, no. 3, 1982, pp. 247–68, doi:</w:t>
       </w:r>
       <w:hyperlink r:id="rId50">
         <w:r>
@@ -4319,18 +4400,30 @@
         <w:t xml:space="preserve"> </w:t>
       </w:r>
       <w:r>
+        <w:rPr>
+          <w:iCs/>
+          <w:i/>
+        </w:rPr>
         <w:t xml:space="preserve">Light</w:t>
       </w:r>
       <w:r>
         <w:t xml:space="preserve"> </w:t>
       </w:r>
       <w:r>
+        <w:rPr>
+          <w:iCs/>
+          <w:i/>
+        </w:rPr>
         <w:t xml:space="preserve">in</w:t>
       </w:r>
       <w:r>
         <w:t xml:space="preserve"> </w:t>
       </w:r>
       <w:r>
+        <w:rPr>
+          <w:iCs/>
+          <w:i/>
+        </w:rPr>
         <w:t xml:space="preserve">August</w:t>
       </w:r>
       <w:r>
@@ -4340,33 +4433,64 @@
         <w:t xml:space="preserve"> </w:t>
       </w:r>
       <w:r>
+        <w:rPr>
+          <w:iCs/>
+          <w:i/>
+        </w:rPr>
         <w:t xml:space="preserve">Absalom</w:t>
       </w:r>
       <w:r>
+        <w:rPr>
+          <w:iCs/>
+          <w:i/>
+        </w:rPr>
         <w:t xml:space="preserve">,</w:t>
       </w:r>
       <w:r>
         <w:t xml:space="preserve"> </w:t>
       </w:r>
       <w:r>
+        <w:rPr>
+          <w:iCs/>
+          <w:i/>
+        </w:rPr>
         <w:t xml:space="preserve">Absalom</w:t>
       </w:r>
       <w:r>
-        <w:t xml:space="preserve">!, And</w:t>
-      </w:r>
-      <w:r>
-        <w:t xml:space="preserve"> </w:t>
-      </w:r>
-      <w:r>
+        <w:rPr>
+          <w:iCs/>
+          <w:i/>
+        </w:rPr>
+        <w:t xml:space="preserve">!</w:t>
+      </w:r>
+      <w:r>
+        <w:t xml:space="preserve">, And</w:t>
+      </w:r>
+      <w:r>
+        <w:t xml:space="preserve"> </w:t>
+      </w:r>
+      <w:r>
+        <w:rPr>
+          <w:iCs/>
+          <w:i/>
+        </w:rPr>
         <w:t xml:space="preserve">Go Down</w:t>
       </w:r>
       <w:r>
+        <w:rPr>
+          <w:iCs/>
+          <w:i/>
+        </w:rPr>
         <w:t xml:space="preserve">,</w:t>
       </w:r>
       <w:r>
         <w:t xml:space="preserve"> </w:t>
       </w:r>
       <w:r>
+        <w:rPr>
+          <w:iCs/>
+          <w:i/>
+        </w:rPr>
         <w:t xml:space="preserve">Moses</w:t>
       </w:r>
       <w:r>
@@ -4540,126 +4664,175 @@
       </w:r>
     </w:p>
     <w:bookmarkEnd w:id="57"/>
-    <w:bookmarkStart w:id="58" w:name="ref-davisSignifyingAbstractionReading"/>
+    <w:bookmarkStart w:id="58" w:name="Xc0ade01a3320741bcbffe58b3e38132b00c207e"/>
     <w:p>
       <w:pPr>
         <w:pStyle w:val="Bibliography"/>
       </w:pPr>
       <w:r>
-        <w:t xml:space="preserve">Davis, Thadious.</w:t>
-      </w:r>
-      <w:r>
-        <w:t xml:space="preserve"> </w:t>
-      </w:r>
-      <w:r>
-        <w:rPr>
-          <w:iCs/>
-          <w:i/>
-        </w:rPr>
-        <w:t xml:space="preserve">The</w:t>
-      </w:r>
-      <w:r>
-        <w:rPr>
-          <w:iCs/>
-          <w:i/>
-        </w:rPr>
-        <w:t xml:space="preserve"> </w:t>
-      </w:r>
-      <w:r>
-        <w:rPr>
-          <w:iCs/>
-          <w:i/>
-        </w:rPr>
+        <w:t xml:space="preserve">Davis, Davis, Thadious M.</w:t>
+      </w:r>
+      <w:r>
+        <w:t xml:space="preserve"> </w:t>
+      </w:r>
+      <w:r>
+        <w:t xml:space="preserve">“The</w:t>
+      </w:r>
+      <w:r>
+        <w:t xml:space="preserve"> </w:t>
+      </w:r>
+      <w:r>
         <w:t xml:space="preserve">Signifying Abstraction</w:t>
       </w:r>
       <w:r>
-        <w:rPr>
-          <w:iCs/>
-          <w:i/>
-        </w:rPr>
         <w:t xml:space="preserve">:</w:t>
       </w:r>
       <w:r>
-        <w:rPr>
-          <w:iCs/>
-          <w:i/>
-        </w:rPr>
-        <w:t xml:space="preserve"> </w:t>
-      </w:r>
-      <w:r>
-        <w:rPr>
-          <w:iCs/>
-          <w:i/>
-        </w:rPr>
+        <w:t xml:space="preserve"> </w:t>
+      </w:r>
+      <w:r>
         <w:t xml:space="preserve">Reading</w:t>
       </w:r>
       <w:r>
-        <w:rPr>
-          <w:iCs/>
-          <w:i/>
-        </w:rPr>
-        <w:t xml:space="preserve"> </w:t>
-      </w:r>
-      <w:r>
-        <w:rPr>
-          <w:iCs/>
-          <w:i/>
-        </w:rPr>
+        <w:t xml:space="preserve"> </w:t>
+      </w:r>
+      <w:r>
         <w:t xml:space="preserve">the</w:t>
       </w:r>
       <w:r>
-        <w:rPr>
-          <w:iCs/>
-          <w:i/>
-        </w:rPr>
-        <w:t xml:space="preserve"> </w:t>
-      </w:r>
-      <w:r>
-        <w:rPr>
-          <w:iCs/>
-          <w:i/>
-        </w:rPr>
+        <w:t xml:space="preserve"> </w:t>
+      </w:r>
+      <w:r>
         <w:t xml:space="preserve">Negro</w:t>
       </w:r>
       <w:r>
-        <w:rPr>
-          <w:iCs/>
-          <w:i/>
-        </w:rPr>
-        <w:t xml:space="preserve"> </w:t>
-      </w:r>
-      <w:r>
-        <w:rPr>
-          <w:iCs/>
-          <w:i/>
-        </w:rPr>
+        <w:t xml:space="preserve"> </w:t>
+      </w:r>
+      <w:r>
         <w:t xml:space="preserve">in</w:t>
       </w:r>
       <w:r>
-        <w:rPr>
-          <w:iCs/>
-          <w:i/>
-        </w:rPr>
-        <w:t xml:space="preserve"> </w:t>
-      </w:r>
-      <w:r>
-        <w:rPr>
-          <w:iCs/>
-          <w:i/>
-        </w:rPr>
+        <w:t xml:space="preserve"> </w:t>
+      </w:r>
+      <w:r>
         <w:t xml:space="preserve">Absalom</w:t>
       </w:r>
       <w:r>
-        <w:t xml:space="preserve">.</w:t>
-      </w:r>
-      <w:r>
-        <w:t xml:space="preserve"> </w:t>
-      </w:r>
-      <w:r>
+        <w:t xml:space="preserve">.”</w:t>
+      </w:r>
+      <w:r>
+        <w:t xml:space="preserve"> </w:t>
+      </w:r>
+      <w:r>
+        <w:rPr>
+          <w:iCs/>
+          <w:i/>
+        </w:rPr>
+        <w:t xml:space="preserve">William</w:t>
+      </w:r>
+      <w:r>
+        <w:rPr>
+          <w:iCs/>
+          <w:i/>
+        </w:rPr>
+        <w:t xml:space="preserve"> </w:t>
+      </w:r>
+      <w:r>
+        <w:rPr>
+          <w:iCs/>
+          <w:i/>
+        </w:rPr>
+        <w:t xml:space="preserve">Faulkner</w:t>
+      </w:r>
+      <w:r>
+        <w:rPr>
+          <w:iCs/>
+          <w:i/>
+        </w:rPr>
+        <w:t xml:space="preserve">’s</w:t>
+      </w:r>
+      <w:r>
+        <w:rPr>
+          <w:iCs/>
+          <w:i/>
+        </w:rPr>
+        <w:t xml:space="preserve"> </w:t>
+      </w:r>
+      <w:r>
+        <w:rPr>
+          <w:iCs/>
+          <w:i/>
+          <w:iCs/>
+          <w:i/>
+        </w:rPr>
         <w:t xml:space="preserve">Absalom</w:t>
       </w:r>
       <w:r>
-        <w:t xml:space="preserve">.</w:t>
+        <w:rPr>
+          <w:iCs/>
+          <w:i/>
+          <w:iCs/>
+          <w:i/>
+        </w:rPr>
+        <w:t xml:space="preserve">,</w:t>
+      </w:r>
+      <w:r>
+        <w:rPr>
+          <w:iCs/>
+          <w:i/>
+        </w:rPr>
+        <w:t xml:space="preserve"> </w:t>
+      </w:r>
+      <w:r>
+        <w:rPr>
+          <w:iCs/>
+          <w:i/>
+          <w:iCs/>
+          <w:i/>
+        </w:rPr>
+        <w:t xml:space="preserve">Absalom</w:t>
+      </w:r>
+      <w:r>
+        <w:rPr>
+          <w:iCs/>
+          <w:i/>
+          <w:iCs/>
+          <w:i/>
+        </w:rPr>
+        <w:t xml:space="preserve">!</w:t>
+      </w:r>
+      <w:r>
+        <w:rPr>
+          <w:iCs/>
+          <w:i/>
+        </w:rPr>
+        <w:t xml:space="preserve">:</w:t>
+      </w:r>
+      <w:r>
+        <w:rPr>
+          <w:iCs/>
+          <w:i/>
+        </w:rPr>
+        <w:t xml:space="preserve"> </w:t>
+      </w:r>
+      <w:r>
+        <w:rPr>
+          <w:iCs/>
+          <w:i/>
+        </w:rPr>
+        <w:t xml:space="preserve">A Casebook</w:t>
+      </w:r>
+      <w:r>
+        <w:t xml:space="preserve">, edited by Fred Hobson,</w:t>
+      </w:r>
+      <w:r>
+        <w:t xml:space="preserve"> </w:t>
+      </w:r>
+      <w:r>
+        <w:t xml:space="preserve">Oxford University Press</w:t>
+      </w:r>
+      <w:r>
+        <w:t xml:space="preserve">, 2003, pp. 69–106.</w:t>
       </w:r>
     </w:p>
     <w:bookmarkEnd w:id="58"/>
@@ -5057,7 +5230,7 @@
         <w:pStyle w:val="Bibliography"/>
       </w:pPr>
       <w:r>
-        <w:t xml:space="preserve">Forster, E. M.</w:t>
+        <w:t xml:space="preserve">Forster, E. M., and Harcourt Brace &amp; Company.</w:t>
       </w:r>
       <w:r>
         <w:t xml:space="preserve"> </w:t>
@@ -5095,16 +5268,34 @@
         <w:t xml:space="preserve"> </w:t>
       </w:r>
       <w:r>
-        <w:t xml:space="preserve">“Absalom,</w:t>
-      </w:r>
-      <w:r>
-        <w:t xml:space="preserve"> </w:t>
-      </w:r>
-      <w:r>
+        <w:t xml:space="preserve">“</w:t>
+      </w:r>
+      <w:r>
+        <w:rPr>
+          <w:iCs/>
+          <w:i/>
+        </w:rPr>
+        <w:t xml:space="preserve">Absalom,</w:t>
+      </w:r>
+      <w:r>
+        <w:t xml:space="preserve"> </w:t>
+      </w:r>
+      <w:r>
+        <w:rPr>
+          <w:iCs/>
+          <w:i/>
+        </w:rPr>
         <w:t xml:space="preserve">Absalom</w:t>
       </w:r>
       <w:r>
-        <w:t xml:space="preserve">!,</w:t>
+        <w:rPr>
+          <w:iCs/>
+          <w:i/>
+        </w:rPr>
+        <w:t xml:space="preserve">!</w:t>
+      </w:r>
+      <w:r>
+        <w:t xml:space="preserve">,</w:t>
       </w:r>
       <w:r>
         <w:t xml:space="preserve"> </w:t>
@@ -5147,16 +5338,7 @@
         <w:t xml:space="preserve">ELH</w:t>
       </w:r>
       <w:r>
-        <w:t xml:space="preserve">, vol. 61, no. 3,</w:t>
-      </w:r>
-      <w:r>
-        <w:t xml:space="preserve"> </w:t>
-      </w:r>
-      <w:r>
-        <w:t xml:space="preserve">Johns Hopkins University Press</w:t>
-      </w:r>
-      <w:r>
-        <w:t xml:space="preserve">, 1994, pp. 685–720.</w:t>
+        <w:t xml:space="preserve">, vol. 61, no. 3, 1994, pp. 685–720.</w:t>
       </w:r>
     </w:p>
     <w:bookmarkEnd w:id="65"/>
@@ -5306,16 +5488,7 @@
         <w:t xml:space="preserve">American Literature</w:t>
       </w:r>
       <w:r>
-        <w:t xml:space="preserve">, vol. 43, no. 1,</w:t>
-      </w:r>
-      <w:r>
-        <w:t xml:space="preserve"> </w:t>
-      </w:r>
-      <w:r>
-        <w:t xml:space="preserve">Duke University Press</w:t>
-      </w:r>
-      <w:r>
-        <w:t xml:space="preserve">, 1971, pp. 97–107, doi:</w:t>
+        <w:t xml:space="preserve">, vol. 43, no. 1, 1971, pp. 97–107, doi:</w:t>
       </w:r>
       <w:hyperlink r:id="rId68">
         <w:r>
@@ -5901,19 +6074,38 @@
         <w:t xml:space="preserve"> </w:t>
       </w:r>
       <w:r>
+        <w:rPr>
+          <w:iCs/>
+          <w:i/>
+        </w:rPr>
         <w:t xml:space="preserve">Absalom</w:t>
       </w:r>
       <w:r>
+        <w:rPr>
+          <w:iCs/>
+          <w:i/>
+        </w:rPr>
         <w:t xml:space="preserve">,</w:t>
       </w:r>
       <w:r>
         <w:t xml:space="preserve"> </w:t>
       </w:r>
       <w:r>
+        <w:rPr>
+          <w:iCs/>
+          <w:i/>
+        </w:rPr>
         <w:t xml:space="preserve">Absalom</w:t>
       </w:r>
       <w:r>
-        <w:t xml:space="preserve">!”</w:t>
+        <w:rPr>
+          <w:iCs/>
+          <w:i/>
+        </w:rPr>
+        <w:t xml:space="preserve">!</w:t>
+      </w:r>
+      <w:r>
+        <w:t xml:space="preserve">”</w:t>
       </w:r>
       <w:r>
         <w:t xml:space="preserve"> </w:t>
@@ -6195,7 +6387,7 @@
       </w:r>
     </w:p>
     <w:bookmarkEnd w:id="80"/>
-    <w:bookmarkStart w:id="81" w:name="X5d08162e079a3b28a0b5f1645cbefc3b630ddea"/>
+    <w:bookmarkStart w:id="81" w:name="Xd3029ae36e1025e3492eadd3ff75d2310d137a7"/>
     <w:p>
       <w:pPr>
         <w:pStyle w:val="Bibliography"/>
@@ -7301,7 +7493,7 @@
         <w:t xml:space="preserve"> </w:t>
       </w:r>
       <w:r>
-        <w:t xml:space="preserve">(Forster)</w:t>
+        <w:t xml:space="preserve">(Forster and Harcourt Brace &amp; Company)</w:t>
       </w:r>
       <w:r>
         <w:t xml:space="preserve">.</w:t>

</xml_diff>